<commit_message>
Spatial concept figures: CC BY paper figures first
Pipelines: Williams et al. 2022 Fig. 1 (sequencing arrays, cropped) and
Fig. 3 (analysis course) before the own drawing, which stays as figure 3
for clusters, condition comparison and cell types. Modules: Traag et al.
2019 Fig. 1 (Louvain) for cluster, merge and hd_cluster; Squair et al.
2021 Fig. 2a (pseudobulk) for condition_de. Licenses checked in Europe
PMC (CC BY 4.0).

Co-Authored-By: Claude Opus 5.5 <noreply@anthropic.com>
</commit_message>
<xml_diff>
--- a/docs/Spatial_Transcriptomics_Visium_HD_Pipeline/pipeline/Portal_Content.docx
+++ b/docs/Spatial_Transcriptomics_Visium_HD_Pipeline/pipeline/Portal_Content.docx
@@ -1232,31 +1232,7 @@
           <w:sz w:val="18"/>
           <w:szCs w:val="18"/>
         </w:rPr>
-        <w:t xml:space="preserve">docs/Spatial_Transcriptomics_Visium_HD_Pipeline/pipeline/figures/concept.png</w:t>
-      </w:r>
-      <w:r>
-        <w:rPr>
-          <w:color w:val="8A8F99"/>
-          <w:sz w:val="18"/>
-          <w:szCs w:val="18"/>
-        </w:rPr>
-        <w:t xml:space="preserve"> (원본 </w:t>
-      </w:r>
-      <w:r>
-        <w:rPr>
-          <w:color w:val="8A8F99"/>
-          <w:sz w:val="18"/>
-          <w:szCs w:val="18"/>
-        </w:rPr>
-        <w:t xml:space="preserve">concept.svg</w:t>
-      </w:r>
-      <w:r>
-        <w:rPr>
-          <w:color w:val="8A8F99"/>
-          <w:sz w:val="18"/>
-          <w:szCs w:val="18"/>
-        </w:rPr>
-        <w:t xml:space="preserve">)</w:t>
+        <w:t xml:space="preserve">docs/Spatial_Transcriptomics_Visium_HD_Pipeline/pipeline/figures/concept_williams2022_fig1_arrays.png</w:t>
       </w:r>
     </w:p>
     <w:p>
@@ -1267,7 +1243,7 @@
       <w:r>
         <w:drawing>
           <wp:inline distT="0" distB="0" distL="0" distR="0">
-            <wp:extent cx="5715000" cy="3876675"/>
+            <wp:extent cx="5715000" cy="4248150"/>
             <wp:effectExtent t="0" r="0" b="0" l="0"/>
             <wp:docPr id="2" name="" descr="" title=""/>
             <wp:cNvGraphicFramePr>
@@ -1292,6 +1268,475 @@
                   <pic:spPr bwMode="auto">
                     <a:xfrm>
                       <a:off x="0" y="0"/>
+                      <a:ext cx="5715000" cy="4248150"/>
+                    </a:xfrm>
+                    <a:prstGeom prst="rect">
+                      <a:avLst/>
+                    </a:prstGeom>
+                  </pic:spPr>
+                </pic:pic>
+              </a:graphicData>
+            </a:graphic>
+          </wp:inline>
+        </w:drawing>
+      </w:r>
+    </w:p>
+    <w:p>
+      <w:pPr>
+        <w:spacing w:after="120"/>
+      </w:pPr>
+      <w:r>
+        <w:rPr>
+          <w:b/>
+          <w:bCs/>
+          <w:color w:val="B0B0B0"/>
+          <w:sz w:val="18"/>
+          <w:szCs w:val="18"/>
+        </w:rPr>
+        <w:t xml:space="preserve">[내부 메모 · 붙여 넣지 마세요] </w:t>
+      </w:r>
+      <w:r>
+        <w:rPr>
+          <w:color w:val="8A8F99"/>
+          <w:sz w:val="18"/>
+          <w:szCs w:val="18"/>
+        </w:rPr>
+        <w:t xml:space="preserve">등록 메모: 논문 그림(CC BY 4.0)을 먼저 씁니다. 그림 1은 Fig. 1에서 시퀀싱 기반(Arrays) 부분만 잘랐고, 그림 2는 Fig. 3 그대로입니다. 논문 그림에 없는 내용(군집, 조건 비교, 세포 유형)은 직접 그린 그림 3으로 보탭니다.</w:t>
+      </w:r>
+    </w:p>
+    <w:p>
+      <w:pPr>
+        <w:spacing w:after="100" w:before="200"/>
+      </w:pPr>
+      <w:r>
+        <w:rPr>
+          <w:b/>
+          <w:bCs/>
+          <w:color w:val="3A3A3A"/>
+          <w:sz w:val="24"/>
+          <w:szCs w:val="24"/>
+        </w:rPr>
+        <w:t xml:space="preserve">국문 (그림 1 설명)</w:t>
+      </w:r>
+    </w:p>
+    <w:p>
+      <w:pPr>
+        <w:spacing w:after="140"/>
+      </w:pPr>
+      <w:r>
+        <w:rPr>
+          <w:b/>
+          <w:bCs/>
+        </w:rPr>
+        <w:t xml:space="preserve">그림 1. 공간 전사체가 위치를 기록하는 원리(시퀀싱 기반).</w:t>
+      </w:r>
+      <w:r>
+        <w:t xml:space="preserve"> 1. 슬라이드에 위치마다 다른 바코드를 붙인 포획 탐침이 깔려 있습니다. 2. 바코드 위치를 이미지로 확인합니다(Visium과 Visium HD는 바코드 위치가 슬라이드를 만들 때 정해져 있어 이 단계가 없습니다). 3. 조직 절편을 올리면 세포의 mRNA가 바로 아래 탐침에 붙고 그 자리의 바코드가 함께 기록됩니다. 4. 붙잡힌 분자를 시퀀싱해 유전자와 바코드(위치)를 함께 읽어 위치별 발현 표를 만듭니다. Visium은 지름 55µm spot, Visium HD는 2µm 사각형 칸(8·16µm로 묶어 씀)입니다. Williams CG et al., Genome Med 14, 68 (2022), Fig. 1 일부(CC BY 4.0).</w:t>
+      </w:r>
+    </w:p>
+    <w:p>
+      <w:pPr>
+        <w:spacing w:after="100" w:before="200"/>
+      </w:pPr>
+      <w:r>
+        <w:rPr>
+          <w:b/>
+          <w:bCs/>
+          <w:color w:val="3A3A3A"/>
+          <w:sz w:val="24"/>
+          <w:szCs w:val="24"/>
+        </w:rPr>
+        <w:t xml:space="preserve">English (Figure 1 legend)</w:t>
+      </w:r>
+    </w:p>
+    <w:p>
+      <w:pPr>
+        <w:spacing w:after="140"/>
+      </w:pPr>
+      <w:r>
+        <w:rPr>
+          <w:b/>
+          <w:bCs/>
+        </w:rPr>
+        <w:t xml:space="preserve">Figure 1. How spatial transcriptomics records location (sequencing-based).</w:t>
+      </w:r>
+      <w:r>
+        <w:t xml:space="preserve"> 1. Capture probes carrying a different barcode at each position cover the slide. 2. Barcode positions are imaged (Visium and Visium HD fix them when the slide is made, so this step is not needed). 3. A tissue section is placed on top; the mRNA of each cell binds the probes directly beneath and is tagged with that position's barcode. 4. Sequencing the captured molecules reads gene and barcode (position) together, giving an expression table per position. Visium uses 55 um spots and Visium HD 2 um squares (grouped into 8 or 16 um bins). Part of Fig. 1 of Williams CG et al., Genome Med 14, 68 (2022) (CC BY 4.0).</w:t>
+      </w:r>
+    </w:p>
+    <w:p>
+      <w:pPr>
+        <w:spacing w:after="100" w:before="200"/>
+      </w:pPr>
+      <w:r>
+        <w:rPr>
+          <w:b/>
+          <w:bCs/>
+          <w:color w:val="3A3A3A"/>
+          <w:sz w:val="24"/>
+          <w:szCs w:val="24"/>
+        </w:rPr>
+        <w:t xml:space="preserve">대체 텍스트 (그림 1)</w:t>
+      </w:r>
+    </w:p>
+    <w:p>
+      <w:pPr>
+        <w:pStyle w:val="ListParagraph"/>
+        <w:numPr>
+          <w:ilvl w:val="0"/>
+          <w:numId w:val="2"/>
+        </w:numPr>
+        <w:spacing w:after="80"/>
+      </w:pPr>
+      <w:r>
+        <w:t xml:space="preserve">국문: 바코드 탐침 배열 위에 조직 절편을 올려 mRNA를 포획하고 시퀀싱하는 과정 그림.</w:t>
+      </w:r>
+    </w:p>
+    <w:p>
+      <w:pPr>
+        <w:pStyle w:val="ListParagraph"/>
+        <w:numPr>
+          <w:ilvl w:val="0"/>
+          <w:numId w:val="2"/>
+        </w:numPr>
+        <w:spacing w:after="80"/>
+      </w:pPr>
+      <w:r>
+        <w:t xml:space="preserve">English: A barcoded probe array, a tissue section placed on it to capture mRNA, and sequencing of the captured probes.</w:t>
+      </w:r>
+    </w:p>
+    <w:p>
+      <w:pPr>
+        <w:spacing w:after="100" w:before="200"/>
+      </w:pPr>
+      <w:r>
+        <w:rPr>
+          <w:b/>
+          <w:bCs/>
+          <w:color w:val="3A3A3A"/>
+          <w:sz w:val="24"/>
+          <w:szCs w:val="24"/>
+        </w:rPr>
+        <w:t xml:space="preserve">출처 (그림 1)</w:t>
+      </w:r>
+    </w:p>
+    <w:p>
+      <w:pPr>
+        <w:spacing w:after="140"/>
+      </w:pPr>
+      <w:r>
+        <w:t xml:space="preserve">Williams CG, Lee HJ, Asatsuma T, Vento-Tormo R, Haque A. An introduction to spatial transcriptomics for biomedical research. </w:t>
+      </w:r>
+      <w:r>
+        <w:rPr>
+          <w:i/>
+          <w:iCs/>
+        </w:rPr>
+        <w:t xml:space="preserve">Genome Medicine</w:t>
+      </w:r>
+      <w:r>
+        <w:t xml:space="preserve"> 14, 68 (2022). https://doi.org/10.1186/s13073-022-01075-1, Fig. 1의 Sequencing methods(Arrays) 부분을 잘라 씀. CC BY 4.0 (https://creativecommons.org/licenses/by/4.0/). 원 그림은 BioRender.com으로 작성됨.</w:t>
+      </w:r>
+    </w:p>
+    <w:p>
+      <w:pPr>
+        <w:spacing w:after="120"/>
+      </w:pPr>
+      <w:r>
+        <w:rPr>
+          <w:b/>
+          <w:bCs/>
+          <w:color w:val="B0B0B0"/>
+          <w:sz w:val="18"/>
+          <w:szCs w:val="18"/>
+        </w:rPr>
+        <w:t xml:space="preserve">[내부 메모 · 붙여 넣지 마세요] </w:t>
+      </w:r>
+      <w:r>
+        <w:rPr>
+          <w:color w:val="8A8F99"/>
+          <w:sz w:val="18"/>
+          <w:szCs w:val="18"/>
+        </w:rPr>
+        <w:t xml:space="preserve">그림: </w:t>
+      </w:r>
+      <w:r>
+        <w:rPr>
+          <w:color w:val="8A8F99"/>
+          <w:sz w:val="18"/>
+          <w:szCs w:val="18"/>
+        </w:rPr>
+        <w:t xml:space="preserve">docs/Spatial_Transcriptomics_Visium_HD_Pipeline/pipeline/figures/concept_williams2022_fig3.png</w:t>
+      </w:r>
+    </w:p>
+    <w:p>
+      <w:pPr>
+        <w:spacing w:after="120" w:before="120"/>
+        <w:jc w:val="center"/>
+      </w:pPr>
+      <w:r>
+        <w:drawing>
+          <wp:inline distT="0" distB="0" distL="0" distR="0">
+            <wp:extent cx="5715000" cy="3762375"/>
+            <wp:effectExtent t="0" r="0" b="0" l="0"/>
+            <wp:docPr id="3" name="" descr="" title=""/>
+            <wp:cNvGraphicFramePr>
+              <a:graphicFrameLocks xmlns:a="http://schemas.openxmlformats.org/drawingml/2006/main" noChangeAspect="1"/>
+            </wp:cNvGraphicFramePr>
+            <a:graphic xmlns:a="http://schemas.openxmlformats.org/drawingml/2006/main">
+              <a:graphicData uri="http://schemas.openxmlformats.org/drawingml/2006/picture">
+                <pic:pic xmlns:pic="http://schemas.openxmlformats.org/drawingml/2006/picture">
+                  <pic:nvPicPr>
+                    <pic:cNvPr id="0" name="" descr=""/>
+                    <pic:cNvPicPr>
+                      <a:picLocks noChangeAspect="1" noChangeArrowheads="1"/>
+                    </pic:cNvPicPr>
+                  </pic:nvPicPr>
+                  <pic:blipFill>
+                    <a:blip r:embed="rId9" cstate="none"/>
+                    <a:srcRect/>
+                    <a:stretch>
+                      <a:fillRect/>
+                    </a:stretch>
+                  </pic:blipFill>
+                  <pic:spPr bwMode="auto">
+                    <a:xfrm>
+                      <a:off x="0" y="0"/>
+                      <a:ext cx="5715000" cy="3762375"/>
+                    </a:xfrm>
+                    <a:prstGeom prst="rect">
+                      <a:avLst/>
+                    </a:prstGeom>
+                  </pic:spPr>
+                </pic:pic>
+              </a:graphicData>
+            </a:graphic>
+          </wp:inline>
+        </w:drawing>
+      </w:r>
+    </w:p>
+    <w:p>
+      <w:pPr>
+        <w:spacing w:after="100" w:before="200"/>
+      </w:pPr>
+      <w:r>
+        <w:rPr>
+          <w:b/>
+          <w:bCs/>
+          <w:color w:val="3A3A3A"/>
+          <w:sz w:val="24"/>
+          <w:szCs w:val="24"/>
+        </w:rPr>
+        <w:t xml:space="preserve">국문 (그림 2 설명)</w:t>
+      </w:r>
+    </w:p>
+    <w:p>
+      <w:pPr>
+        <w:spacing w:after="140"/>
+      </w:pPr>
+      <w:r>
+        <w:rPr>
+          <w:b/>
+          <w:bCs/>
+        </w:rPr>
+        <w:t xml:space="preserve">그림 2. 공간 전사체 분석의 일반적인 흐름.</w:t>
+      </w:r>
+      <w:r>
+        <w:t xml:space="preserve"> 시퀀싱 기반 자료(오른쪽: Visium, Visium HD)는 정렬과 위치 매핑(Space Ranger, 이 파이프라인의 앞 단계)을 거친 뒤 정규화하고, 군집, 공간 분석, 세포 유형 추정(deconvolution) 같은 하류 분석을 거쳐 차등 발현 같은 생물학적 해석으로 이어집니다. 이 파이프라인은 정규화부터 차등 발현까지를 맡습니다. 이미징 기반 자료(왼쪽)는 이 파이프라인의 입력이 아닙니다. Williams CG et al., Genome Med 14, 68 (2022), Fig. 3(CC BY 4.0).</w:t>
+      </w:r>
+    </w:p>
+    <w:p>
+      <w:pPr>
+        <w:spacing w:after="100" w:before="200"/>
+      </w:pPr>
+      <w:r>
+        <w:rPr>
+          <w:b/>
+          <w:bCs/>
+          <w:color w:val="3A3A3A"/>
+          <w:sz w:val="24"/>
+          <w:szCs w:val="24"/>
+        </w:rPr>
+        <w:t xml:space="preserve">English (Figure 2 legend)</w:t>
+      </w:r>
+    </w:p>
+    <w:p>
+      <w:pPr>
+        <w:spacing w:after="140"/>
+      </w:pPr>
+      <w:r>
+        <w:rPr>
+          <w:b/>
+          <w:bCs/>
+        </w:rPr>
+        <w:t xml:space="preserve">Figure 2. The usual course of a spatial transcriptomics analysis.</w:t>
+      </w:r>
+      <w:r>
+        <w:t xml:space="preserve"> Sequencing-based data (right: Visium, Visium HD) are aligned and mapped to positions (Space Ranger, before this pipeline), normalised, and passed to downstream analyses such as clustering, spatial analysis and cell-type deconvolution, leading to biological inference such as differential expression. This pipeline covers normalisation through differential expression; imaging-based data (left) are not its input. Fig. 3 of Williams CG et al., Genome Med 14, 68 (2022) (CC BY 4.0).</w:t>
+      </w:r>
+    </w:p>
+    <w:p>
+      <w:pPr>
+        <w:spacing w:after="100" w:before="200"/>
+      </w:pPr>
+      <w:r>
+        <w:rPr>
+          <w:b/>
+          <w:bCs/>
+          <w:color w:val="3A3A3A"/>
+          <w:sz w:val="24"/>
+          <w:szCs w:val="24"/>
+        </w:rPr>
+        <w:t xml:space="preserve">대체 텍스트 (그림 2)</w:t>
+      </w:r>
+    </w:p>
+    <w:p>
+      <w:pPr>
+        <w:pStyle w:val="ListParagraph"/>
+        <w:numPr>
+          <w:ilvl w:val="0"/>
+          <w:numId w:val="2"/>
+        </w:numPr>
+        <w:spacing w:after="80"/>
+      </w:pPr>
+      <w:r>
+        <w:t xml:space="preserve">국문: 이미징·시퀀싱 자료가 정규화, 하류 분석, 생물학적 해석으로 이어지는 흐름도.</w:t>
+      </w:r>
+    </w:p>
+    <w:p>
+      <w:pPr>
+        <w:pStyle w:val="ListParagraph"/>
+        <w:numPr>
+          <w:ilvl w:val="0"/>
+          <w:numId w:val="2"/>
+        </w:numPr>
+        <w:spacing w:after="80"/>
+      </w:pPr>
+      <w:r>
+        <w:t xml:space="preserve">English: Flow chart from imaging and sequencing data through normalisation and downstream analysis to biological inference.</w:t>
+      </w:r>
+    </w:p>
+    <w:p>
+      <w:pPr>
+        <w:spacing w:after="100" w:before="200"/>
+      </w:pPr>
+      <w:r>
+        <w:rPr>
+          <w:b/>
+          <w:bCs/>
+          <w:color w:val="3A3A3A"/>
+          <w:sz w:val="24"/>
+          <w:szCs w:val="24"/>
+        </w:rPr>
+        <w:t xml:space="preserve">출처 (그림 2)</w:t>
+      </w:r>
+    </w:p>
+    <w:p>
+      <w:pPr>
+        <w:spacing w:after="140"/>
+      </w:pPr>
+      <w:r>
+        <w:t xml:space="preserve">Williams CG, Lee HJ, Asatsuma T, Vento-Tormo R, Haque A. An introduction to spatial transcriptomics for biomedical research. </w:t>
+      </w:r>
+      <w:r>
+        <w:rPr>
+          <w:i/>
+          <w:iCs/>
+        </w:rPr>
+        <w:t xml:space="preserve">Genome Medicine</w:t>
+      </w:r>
+      <w:r>
+        <w:t xml:space="preserve"> 14, 68 (2022). https://doi.org/10.1186/s13073-022-01075-1, Fig. 3을 그대로 씀. CC BY 4.0 (https://creativecommons.org/licenses/by/4.0/). 원 그림은 BioRender.com으로 작성됨.</w:t>
+      </w:r>
+    </w:p>
+    <w:p>
+      <w:pPr>
+        <w:spacing w:after="120"/>
+      </w:pPr>
+      <w:r>
+        <w:rPr>
+          <w:b/>
+          <w:bCs/>
+          <w:color w:val="B0B0B0"/>
+          <w:sz w:val="18"/>
+          <w:szCs w:val="18"/>
+        </w:rPr>
+        <w:t xml:space="preserve">[내부 메모 · 붙여 넣지 마세요] </w:t>
+      </w:r>
+      <w:r>
+        <w:rPr>
+          <w:color w:val="8A8F99"/>
+          <w:sz w:val="18"/>
+          <w:szCs w:val="18"/>
+        </w:rPr>
+        <w:t xml:space="preserve">그림: </w:t>
+      </w:r>
+      <w:r>
+        <w:rPr>
+          <w:color w:val="8A8F99"/>
+          <w:sz w:val="18"/>
+          <w:szCs w:val="18"/>
+        </w:rPr>
+        <w:t xml:space="preserve">docs/Spatial_Transcriptomics_Visium_HD_Pipeline/pipeline/figures/concept.png</w:t>
+      </w:r>
+      <w:r>
+        <w:rPr>
+          <w:color w:val="8A8F99"/>
+          <w:sz w:val="18"/>
+          <w:szCs w:val="18"/>
+        </w:rPr>
+        <w:t xml:space="preserve"> (원본 </w:t>
+      </w:r>
+      <w:r>
+        <w:rPr>
+          <w:color w:val="8A8F99"/>
+          <w:sz w:val="18"/>
+          <w:szCs w:val="18"/>
+        </w:rPr>
+        <w:t xml:space="preserve">concept.svg</w:t>
+      </w:r>
+      <w:r>
+        <w:rPr>
+          <w:color w:val="8A8F99"/>
+          <w:sz w:val="18"/>
+          <w:szCs w:val="18"/>
+        </w:rPr>
+        <w:t xml:space="preserve">)</w:t>
+      </w:r>
+    </w:p>
+    <w:p>
+      <w:pPr>
+        <w:spacing w:after="120" w:before="120"/>
+        <w:jc w:val="center"/>
+      </w:pPr>
+      <w:r>
+        <w:drawing>
+          <wp:inline distT="0" distB="0" distL="0" distR="0">
+            <wp:extent cx="5715000" cy="3876675"/>
+            <wp:effectExtent t="0" r="0" b="0" l="0"/>
+            <wp:docPr id="4" name="" descr="" title=""/>
+            <wp:cNvGraphicFramePr>
+              <a:graphicFrameLocks xmlns:a="http://schemas.openxmlformats.org/drawingml/2006/main" noChangeAspect="1"/>
+            </wp:cNvGraphicFramePr>
+            <a:graphic xmlns:a="http://schemas.openxmlformats.org/drawingml/2006/main">
+              <a:graphicData uri="http://schemas.openxmlformats.org/drawingml/2006/picture">
+                <pic:pic xmlns:pic="http://schemas.openxmlformats.org/drawingml/2006/picture">
+                  <pic:nvPicPr>
+                    <pic:cNvPr id="0" name="" descr=""/>
+                    <pic:cNvPicPr>
+                      <a:picLocks noChangeAspect="1" noChangeArrowheads="1"/>
+                    </pic:cNvPicPr>
+                  </pic:nvPicPr>
+                  <pic:blipFill>
+                    <a:blip r:embed="rId10" cstate="none"/>
+                    <a:srcRect/>
+                    <a:stretch>
+                      <a:fillRect/>
+                    </a:stretch>
+                  </pic:blipFill>
+                  <pic:spPr bwMode="auto">
+                    <a:xfrm>
+                      <a:off x="0" y="0"/>
                       <a:ext cx="5715000" cy="3876675"/>
                     </a:xfrm>
                     <a:prstGeom prst="rect">
@@ -1317,19 +1762,19 @@
           <w:sz w:val="24"/>
           <w:szCs w:val="24"/>
         </w:rPr>
-        <w:t xml:space="preserve">국문 (그림 설명)</w:t>
-      </w:r>
-    </w:p>
-    <w:p>
-      <w:pPr>
-        <w:spacing w:after="140"/>
-      </w:pPr>
-      <w:r>
-        <w:rPr>
-          <w:b/>
-          <w:bCs/>
-        </w:rPr>
-        <w:t xml:space="preserve">그림. 공간 전사체 분석의 원리.</w:t>
+        <w:t xml:space="preserve">국문 (그림 3 설명)</w:t>
+      </w:r>
+    </w:p>
+    <w:p>
+      <w:pPr>
+        <w:spacing w:after="140"/>
+      </w:pPr>
+      <w:r>
+        <w:rPr>
+          <w:b/>
+          <w:bCs/>
+        </w:rPr>
+        <w:t xml:space="preserve">그림 3. 이 파이프라인의 분석 원리.</w:t>
       </w:r>
       <w:r>
         <w:t xml:space="preserve"> (A) 조직 절편 위의 격자에서 위치마다 유전자 발현을 셉니다. Visium은 지름 55µm spot(spot마다 세포 1~10개)이고, Visium HD는 2µm 사각형을 8µm 또는 16µm bin으로 묶어 세포 크기에 가까운 해상도로 봅니다. 이 파이프라인은 Visium HD bin을 분석합니다. (B) 발현이 비슷한 bin을 군집으로 묶어 조직 위에 칠하면 층 구조나 핵 같은 조직 영역이 드러나고, UMAP에서는 군집이 서로 떨어진 점 무리로 보입니다. (C) 조건 비교는 같은 군집(같은 영역) 안에서 합니다. 슬라이드마다 그 군집 bin의 count를 합친 pseudobulk를 만들고, 슬라이드를 반복으로 삼아 DESeq2로 조건 간 차이를 검정합니다. 조건마다 슬라이드가 한 장뿐이면 bin 단위 검정만 할 수 있으며 탐색용입니다. (D) 같은 조직의 단일세포 참조 자료가 있으면, 참조의 세포 유형별 발현 특징으로 위치마다 세포 유형을 추정합니다. Visium spot은 세포가 섞여 있어 비율로, Visium HD bin은 세포 하나 크기라 유형으로 붙이고, 그 결과로 세포 유형별 조건 비교도 할 수 있습니다. 참조가 없으면 이 단계는 건너뜁니다. 조직 모양, 군집, count 값은 모식적인 값입니다.</w:t>
@@ -1347,19 +1792,19 @@
           <w:sz w:val="24"/>
           <w:szCs w:val="24"/>
         </w:rPr>
-        <w:t xml:space="preserve">English (figure legend)</w:t>
-      </w:r>
-    </w:p>
-    <w:p>
-      <w:pPr>
-        <w:spacing w:after="140"/>
-      </w:pPr>
-      <w:r>
-        <w:rPr>
-          <w:b/>
-          <w:bCs/>
-        </w:rPr>
-        <w:t xml:space="preserve">Figure. Principle of spatial transcriptomics analysis.</w:t>
+        <w:t xml:space="preserve">English (Figure 3 legend)</w:t>
+      </w:r>
+    </w:p>
+    <w:p>
+      <w:pPr>
+        <w:spacing w:after="140"/>
+      </w:pPr>
+      <w:r>
+        <w:rPr>
+          <w:b/>
+          <w:bCs/>
+        </w:rPr>
+        <w:t xml:space="preserve">Figure 3. Analysis principle of this pipeline.</w:t>
       </w:r>
       <w:r>
         <w:t xml:space="preserve"> (A) Gene expression is counted at each position of a grid over the tissue section: Visium uses 55 um spots (1-10 cells each), and Visium HD groups 2 um squares into 8 or 16 um bins, close to cellular resolution. This pipeline analyses Visium HD bins. (B) Bins with similar expression are grouped into clusters; painted on the tissue they reveal regions such as layers and nuclei, and in the UMAP they form separate groups of points. (C) Conditions are compared within one cluster (one region). For each slide the counts of that cluster's bins are summed into a pseudobulk sample, and DESeq2 tests the condition with slides as replicates. With one slide per condition only a bin-level test is possible, which is exploratory. (D) With a single-cell reference of the same tissue, cell types are estimated at each position from the reference's per-type expression profiles: as proportions in Visium spots, which hold several cells, and as one type per Visium HD bin, which is about one cell; conditions can then also be compared per cell type. Without a reference this step is skipped. Tissue shape, clusters and counts are schematic.</w:t>
@@ -1377,7 +1822,7 @@
           <w:sz w:val="24"/>
           <w:szCs w:val="24"/>
         </w:rPr>
-        <w:t xml:space="preserve">대체 텍스트 (alt)</w:t>
+        <w:t xml:space="preserve">대체 텍스트 (그림 3)</w:t>
       </w:r>
     </w:p>
     <w:p>
@@ -1418,7 +1863,7 @@
           <w:sz w:val="24"/>
           <w:szCs w:val="24"/>
         </w:rPr>
-        <w:t xml:space="preserve">출처 / Reference</w:t>
+        <w:t xml:space="preserve">출처 (그림 3)</w:t>
       </w:r>
     </w:p>
     <w:p>

</xml_diff>

<commit_message>
Spatial HD: condition_de (tumor vs normal) and hd_svf 1.1 results from CLOSHA; pipeline representative image
Co-Authored-By: Claude Opus 5.5 <noreply@anthropic.com>
</commit_message>
<xml_diff>
--- a/docs/Spatial_Transcriptomics_Visium_HD_Pipeline/pipeline/Portal_Content.docx
+++ b/docs/Spatial_Transcriptomics_Visium_HD_Pipeline/pipeline/Portal_Content.docx
@@ -679,7 +679,14 @@
                 <w:sz w:val="18"/>
                 <w:szCs w:val="18"/>
               </w:rPr>
-              <w:t xml:space="preserve">등록 메모: 결과 그림을 본 뒤 고릅니다(후보: spatial_hd_cluster 조직 위 군집).</w:t>
+              <w:t xml:space="preserve">docs/Spatial_Transcriptomics_Visium_HD_Pipeline/pipeline/figures/representative.png</w:t>
+            </w:r>
+            <w:r>
+              <w:rPr>
+                <w:sz w:val="18"/>
+                <w:szCs w:val="18"/>
+              </w:rPr>
+              <w:t xml:space="preserve"> (spatial_hd_rctd 결과 1: 대장암 crc_p1의 bin별 세포 유형. 종양·기질·정상 점막·근육층이 한눈에 나뉨)</w:t>
             </w:r>
           </w:p>
         </w:tc>

</xml_diff>

<commit_message>
Spatial: 4 cores and 64 GB per module (hd_rctd 8 cores) after the CLOSHA measurements
Co-Authored-By: Claude Opus 5.5 <noreply@anthropic.com>
</commit_message>
<xml_diff>
--- a/docs/Spatial_Transcriptomics_Visium_HD_Pipeline/pipeline/Portal_Content.docx
+++ b/docs/Spatial_Transcriptomics_Visium_HD_Pipeline/pipeline/Portal_Content.docx
@@ -2050,7 +2050,7 @@
         <w:t xml:space="preserve">메모리를 많이 씁니다.</w:t>
       </w:r>
       <w:r>
-        <w:t xml:space="preserve"> spatial_hd_prep과 spatial_hd_svf는 64GB, 통합 군집(spatial_hd_cluster)과 세포 유형(spatial_hd_rctd)은 128GB를 권장합니다. 메모리가 부족하면 bin 크기 16µm를 쓰거나 </w:t>
+        <w:t xml:space="preserve"> 모든 모듈에 64GB를 권장합니다. 예시 데이터(대장암 5장, 16µm)에서 가장 많이 쓴 모듈은 통합 군집(spatial_hd_cluster)으로 약 31GB였습니다. 슬라이드가 많거나 8µm bin을 쓰면 메모리가 늘어나므로, 부족하면 bin 크기 16µm를 쓰거나 </w:t>
       </w:r>
       <w:r>
         <w:t xml:space="preserve">min_counts</w:t>
@@ -2252,7 +2252,7 @@
         <w:t xml:space="preserve">Memory use is high.</w:t>
       </w:r>
       <w:r>
-        <w:t xml:space="preserve"> 64 GB is recommended for spatial_hd_prep and spatial_hd_svf, and 128 GB for joint clustering (spatial_hd_cluster) and cell types (spatial_hd_rctd). When memory runs out, use 16 um bins or a higher </w:t>
+        <w:t xml:space="preserve"> 64 GB is recommended for every module. In the example data (five colorectal slides, 16 um) joint clustering (spatial_hd_cluster) used the most, about 31 GB. More slides or 8 um bins need more memory; when it runs out, use 16 um bins or a higher </w:t>
       </w:r>
       <w:r>
         <w:t xml:space="preserve">min_counts</w:t>

</xml_diff>

<commit_message>
Spatial notes: check the reference column with check_reference before running the pipeline
Co-Authored-By: Claude Opus 5.5 <noreply@anthropic.com>
</commit_message>
<xml_diff>
--- a/docs/Spatial_Transcriptomics_Visium_HD_Pipeline/pipeline/Portal_Content.docx
+++ b/docs/Spatial_Transcriptomics_Visium_HD_Pipeline/pipeline/Portal_Content.docx
@@ -2082,7 +2082,7 @@
         <w:t xml:space="preserve">group_by=rctd_first_type</w:t>
       </w:r>
       <w:r>
-        <w:t xml:space="preserve">) 조건을 비교합니다. 참조를 주지 않으면 이 두 단계는 건너뛰고 나머지 분석은 그대로 끝나며, 군집은 마커 유전자와 조직 위치로 해석합니다. 공개 단일세포 아틀라스(예: CELLxGENE, Allen Brain Cell Atlas)를 참조로 쓸 수 있습니다. 열 이름을 모르면 비워 두고 실행하면 분석 전에 멈추고 오류 로그에 후보 열을 보여 줍니다.</w:t>
+        <w:t xml:space="preserve">) 조건을 비교합니다. 참조를 주지 않으면 이 두 단계는 건너뛰고 나머지 분석은 그대로 끝나며, 군집은 마커 유전자와 조직 위치로 해석합니다. 공개 단일세포 아틀라스(예: CELLxGENE, Allen Brain Cell Atlas)를 참조로 쓸 수 있습니다. 열 이름을 모르면 파이프라인을 돌리기 전에 check_reference 모듈에 참조 자료만 넣어 실행해 후보 열을 확인해 주세요. 파이프라인 안에서는 spatial_hd_rctd가 앞 단계(정규화, 군집)가 끝난 뒤에 실행되므로, 열 이름을 비워 두면 그때 멈추고 오류 로그에 후보 열을 보여 줍니다.</w:t>
       </w:r>
     </w:p>
     <w:p>
@@ -2284,7 +2284,7 @@
         <w:t xml:space="preserve">group_by=rctd_first_type</w:t>
       </w:r>
       <w:r>
-        <w:t xml:space="preserve">). Without a reference these two steps are skipped and the rest of the analysis finishes as usual; clusters are then interpreted by their marker genes and tissue location. Public single-cell atlases (for example CELLxGENE, Allen Brain Cell Atlas) can serve as references. If the column name is unknown, leave it empty: the run stops before the analysis and the error log lists the candidate columns.</w:t>
+        <w:t xml:space="preserve">). Without a reference these two steps are skipped and the rest of the analysis finishes as usual; clusters are then interpreted by their marker genes and tissue location. Public single-cell atlases (for example CELLxGENE, Allen Brain Cell Atlas) can serve as references. If the column name is unknown, run the check_reference module with the reference alone before the pipeline to see the candidate columns. In the pipeline spatial_hd_rctd runs after the earlier steps (normalisation, clustering), so with the column left empty the run stops only then, listing the candidate columns in the error log.</w:t>
       </w:r>
     </w:p>
     <w:p>

</xml_diff>

<commit_message>
Visium HD map: check_reference as a dashed pre-check beside the reference input
Co-Authored-By: Claude Opus 5.5 <noreply@anthropic.com>
</commit_message>
<xml_diff>
--- a/docs/Spatial_Transcriptomics_Visium_HD_Pipeline/pipeline/Portal_Content.docx
+++ b/docs/Spatial_Transcriptomics_Visium_HD_Pipeline/pipeline/Portal_Content.docx
@@ -1176,7 +1176,7 @@
         <w:spacing w:after="80"/>
       </w:pPr>
       <w:r>
-        <w:t xml:space="preserve">국문: Visium HD 공간 전사체 파이프라인 흐름도. bin 불러오기·정규화·sketch(spatial_hd_prep), 슬라이드 통합 군집과 모든 bin 배정(spatial_hd_cluster) 뒤 조건 간 비교(spatial_condition_de), 공간 가변 유전자(spatial_hd_svf), 단일세포 참조로 모든 bin에 세포 유형을 붙이는 분석(spatial_hd_rctd)으로 갈라지고, 세포 유형 결과가 세포 유형별 조건 간 비교(spatial_condition_de)로 이어짐. 세포 유형 분석은 참조를 줄 때만 실행됨.</w:t>
+        <w:t xml:space="preserve">국문: Visium HD 공간 전사체 파이프라인 흐름도. bin 불러오기·정규화·sketch(spatial_hd_prep), 슬라이드 통합 군집과 모든 bin 배정(spatial_hd_cluster) 뒤 조건 간 비교(spatial_condition_de), 공간 가변 유전자(spatial_hd_svf), 단일세포 참조로 모든 bin에 세포 유형을 붙이는 분석(spatial_hd_rctd)으로 갈라지고, 세포 유형 결과가 세포 유형별 조건 간 비교(spatial_condition_de)로 이어짐. 세포 유형 분석은 참조를 줄 때만 실행됨. 참조의 세포 유형 열 이름은 파이프라인 밖의 check_reference(점선)로 미리 확인할 수 있음.</w:t>
       </w:r>
     </w:p>
     <w:p>
@@ -1189,7 +1189,7 @@
         <w:spacing w:after="80"/>
       </w:pPr>
       <w:r>
-        <w:t xml:space="preserve">English: Visium HD spatial transcriptomics workflow: bin loading, normalisation and sketching (spatial_hd_prep), joint clustering of slides with labels for every bin (spatial_hd_cluster), then condition comparison (spatial_condition_de), spatially variable genes (spatial_hd_svf), and cell types for every bin from a single-cell reference (spatial_hd_rctd) followed by condition comparison per cell type (spatial_condition_de); the cell-type branch runs only when a reference is given.</w:t>
+        <w:t xml:space="preserve">English: Visium HD spatial transcriptomics workflow: bin loading, normalisation and sketching (spatial_hd_prep), joint clustering of slides with labels for every bin (spatial_hd_cluster), then condition comparison (spatial_condition_de), spatially variable genes (spatial_hd_svf), and cell types for every bin from a single-cell reference (spatial_hd_rctd) followed by condition comparison per cell type (spatial_condition_de); the cell-type branch runs only when a reference is given. The cell-type column of the reference can be checked beforehand with check_reference, outside the pipeline (dashed).</w:t>
       </w:r>
     </w:p>
     <w:p>

</xml_diff>